<commit_message>
Add v8-Chain results and protocol figures to thesis documents
Workbook: v8-Chain rows and routing-mode comparison. Report: new
section 8.4 with table, flowchart and topology figures. Slides: three
v8-Chain slides and updated evolution table, findings and conclusion.

Co-Authored-By: Claude Opus 5.5 <noreply@anthropic.com>
Claude-Session: https://claude.ai/code/session_019rZdtfEbJpAbmcB9G79J6K
</commit_message>
<xml_diff>
--- a/thesis-v8/SOTA_Report_EN_v8.docx
+++ b/thesis-v8/SOTA_Report_EN_v8.docx
@@ -5886,6 +5886,144 @@
           </w:p>
         </w:tc>
       </w:tr>
+      <w:tr>
+        <w:trPr>
+          <w:trHeight w:val="727"/>
+        </w:trPr>
+        <w:tc>
+          <w:tcPr>
+            <w:tcW w:w="1683" w:type="dxa"/>
+            <w:shd w:val="clear" w:color="auto" w:fill="F2F6F8"/>
+          </w:tcPr>
+          <w:p>
+            <w:pPr>
+              <w:jc w:val="center"/>
+            </w:pPr>
+            <w:r>
+              <w:rPr>
+                <w:rFonts w:ascii="Calibri" w:eastAsia="Calibri" w:hAnsi="Calibri" w:cs="Calibri"/>
+                <w:b/>
+                <w:bCs/>
+              </w:rPr>
+              <w:t xml:space="preserve">Proposed Protocol (Final, any BS placement)</w:t>
+            </w:r>
+          </w:p>
+        </w:tc>
+        <w:tc>
+          <w:tcPr>
+            <w:tcW w:w="1949" w:type="dxa"/>
+            <w:shd w:val="clear" w:color="auto" w:fill="F2F6F8"/>
+          </w:tcPr>
+          <w:p>
+            <w:pPr>
+              <w:jc w:val="center"/>
+            </w:pPr>
+            <w:r>
+              <w:rPr>
+                <w:rFonts w:ascii="Calibri" w:eastAsia="Calibri" w:hAnsi="Calibri" w:cs="Calibri"/>
+                <w:b/>
+                <w:bCs/>
+              </w:rPr>
+              <w:t xml:space="preserve">v8-Chain (Far BS)</w:t>
+            </w:r>
+          </w:p>
+        </w:tc>
+        <w:tc>
+          <w:tcPr>
+            <w:tcW w:w="974" w:type="dxa"/>
+            <w:shd w:val="clear" w:color="auto" w:fill="F2F6F8"/>
+          </w:tcPr>
+          <w:p>
+            <w:pPr>
+              <w:jc w:val="center"/>
+            </w:pPr>
+            <w:r>
+              <w:rPr>
+                <w:rFonts w:ascii="Calibri" w:eastAsia="Calibri" w:hAnsi="Calibri" w:cs="Calibri"/>
+                <w:b/>
+                <w:bCs/>
+              </w:rPr>
+              <w:t xml:space="preserve">1716</w:t>
+            </w:r>
+          </w:p>
+        </w:tc>
+        <w:tc>
+          <w:tcPr>
+            <w:tcW w:w="1063" w:type="dxa"/>
+            <w:shd w:val="clear" w:color="auto" w:fill="F2F6F8"/>
+          </w:tcPr>
+          <w:p>
+            <w:pPr>
+              <w:jc w:val="center"/>
+            </w:pPr>
+            <w:r>
+              <w:rPr>
+                <w:rFonts w:ascii="Calibri" w:eastAsia="Calibri" w:hAnsi="Calibri" w:cs="Calibri"/>
+                <w:b/>
+                <w:bCs/>
+              </w:rPr>
+              <w:t xml:space="preserve">1886</w:t>
+            </w:r>
+          </w:p>
+        </w:tc>
+        <w:tc>
+          <w:tcPr>
+            <w:tcW w:w="1151" w:type="dxa"/>
+            <w:shd w:val="clear" w:color="auto" w:fill="F2F6F8"/>
+          </w:tcPr>
+          <w:p>
+            <w:pPr>
+              <w:jc w:val="center"/>
+            </w:pPr>
+            <w:r>
+              <w:rPr>
+                <w:rFonts w:ascii="Calibri" w:eastAsia="Calibri" w:hAnsi="Calibri" w:cs="Calibri"/>
+                <w:b/>
+                <w:bCs/>
+              </w:rPr>
+              <w:t xml:space="preserve">1956</w:t>
+            </w:r>
+          </w:p>
+        </w:tc>
+        <w:tc>
+          <w:tcPr>
+            <w:tcW w:w="974" w:type="dxa"/>
+            <w:shd w:val="clear" w:color="auto" w:fill="F2F6F8"/>
+          </w:tcPr>
+          <w:p>
+            <w:pPr>
+              <w:jc w:val="center"/>
+            </w:pPr>
+            <w:r>
+              <w:rPr>
+                <w:rFonts w:ascii="Calibri" w:eastAsia="Calibri" w:hAnsi="Calibri" w:cs="Calibri"/>
+                <w:b/>
+                <w:bCs/>
+              </w:rPr>
+              <w:t xml:space="preserve">99.07%</w:t>
+            </w:r>
+          </w:p>
+        </w:tc>
+        <w:tc>
+          <w:tcPr>
+            <w:tcW w:w="2850" w:type="dxa"/>
+            <w:shd w:val="clear" w:color="auto" w:fill="F2F6F8"/>
+          </w:tcPr>
+          <w:p>
+            <w:pPr>
+              <w:jc w:val="center"/>
+            </w:pPr>
+            <w:r>
+              <w:rPr>
+                <w:rFonts w:ascii="Calibri" w:eastAsia="Calibri" w:hAnsi="Calibri" w:cs="Calibri"/>
+                <w:b/>
+                <w:bCs/>
+              </w:rPr>
+              <w:t xml:space="preserve">Energy-aware CH relay: equals v8 at the center BS and closes the far-BS gap to v7 (FND +36%, PDR +0.9 pp, HND/LND within 1%).</w:t>
+            </w:r>
+          </w:p>
+        </w:tc>
+      </w:tr>
     </w:tbl>
     <w:p/>
     <w:p>
@@ -7591,6 +7729,176 @@
             </w:pPr>
             <w:r>
               <w:t xml:space="preserve">98.66%</w:t>
+            </w:r>
+          </w:p>
+        </w:tc>
+      </w:tr>
+      <w:tr>
+        <w:trPr>
+          <w:trHeight w:val="921"/>
+          <w:jc w:val="center"/>
+        </w:trPr>
+        <w:tc>
+          <w:tcPr>
+            <w:tcW w:w="990" w:type="dxa"/>
+          </w:tcPr>
+          <w:p>
+            <w:pPr>
+              <w:jc w:val="center"/>
+            </w:pPr>
+            <w:r>
+              <w:rPr>
+                <w:b/>
+              </w:rPr>
+              <w:lastRenderedPageBreak/>
+              <w:t xml:space="preserve">v8-Chain (Center)</w:t>
+            </w:r>
+          </w:p>
+        </w:tc>
+        <w:tc>
+          <w:tcPr>
+            <w:tcW w:w="5495" w:type="dxa"/>
+          </w:tcPr>
+          <w:p>
+            <w:r>
+              <w:t xml:space="preserve">v8 + energy-aware CH-to-CH relay (relay only when cheaper)</w:t>
+            </w:r>
+          </w:p>
+        </w:tc>
+        <w:tc>
+          <w:tcPr>
+            <w:tcW w:w="1186" w:type="dxa"/>
+          </w:tcPr>
+          <w:p>
+            <w:pPr>
+              <w:jc w:val="center"/>
+            </w:pPr>
+            <w:r>
+              <w:t xml:space="preserve">2621</w:t>
+            </w:r>
+          </w:p>
+        </w:tc>
+        <w:tc>
+          <w:tcPr>
+            <w:tcW w:w="1094" w:type="dxa"/>
+          </w:tcPr>
+          <w:p>
+            <w:pPr>
+              <w:jc w:val="center"/>
+            </w:pPr>
+            <w:r>
+              <w:t xml:space="preserve">2711</w:t>
+            </w:r>
+          </w:p>
+        </w:tc>
+        <w:tc>
+          <w:tcPr>
+            <w:tcW w:w="1094" w:type="dxa"/>
+          </w:tcPr>
+          <w:p>
+            <w:pPr>
+              <w:jc w:val="center"/>
+            </w:pPr>
+            <w:r>
+              <w:t xml:space="preserve">2756</w:t>
+            </w:r>
+          </w:p>
+        </w:tc>
+        <w:tc>
+          <w:tcPr>
+            <w:tcW w:w="1029" w:type="dxa"/>
+          </w:tcPr>
+          <w:p>
+            <w:pPr>
+              <w:jc w:val="center"/>
+            </w:pPr>
+            <w:r>
+              <w:t xml:space="preserve">99.27%</w:t>
+            </w:r>
+          </w:p>
+        </w:tc>
+      </w:tr>
+      <w:tr>
+        <w:trPr>
+          <w:trHeight w:val="921"/>
+          <w:jc w:val="center"/>
+        </w:trPr>
+        <w:tc>
+          <w:tcPr>
+            <w:tcW w:w="990" w:type="dxa"/>
+          </w:tcPr>
+          <w:p>
+            <w:pPr>
+              <w:jc w:val="center"/>
+            </w:pPr>
+            <w:r>
+              <w:rPr>
+                <w:b/>
+              </w:rPr>
+              <w:lastRenderedPageBreak/>
+              <w:t xml:space="preserve">v8-Chain (Far BS)</w:t>
+            </w:r>
+          </w:p>
+        </w:tc>
+        <w:tc>
+          <w:tcPr>
+            <w:tcW w:w="5495" w:type="dxa"/>
+          </w:tcPr>
+          <w:p>
+            <w:r>
+              <w:t xml:space="preserve">Same; BS far (50,-100) — CHs form a relay chain automatically</w:t>
+            </w:r>
+          </w:p>
+        </w:tc>
+        <w:tc>
+          <w:tcPr>
+            <w:tcW w:w="1186" w:type="dxa"/>
+          </w:tcPr>
+          <w:p>
+            <w:pPr>
+              <w:jc w:val="center"/>
+            </w:pPr>
+            <w:r>
+              <w:t xml:space="preserve">1716</w:t>
+            </w:r>
+          </w:p>
+        </w:tc>
+        <w:tc>
+          <w:tcPr>
+            <w:tcW w:w="1094" w:type="dxa"/>
+          </w:tcPr>
+          <w:p>
+            <w:pPr>
+              <w:jc w:val="center"/>
+            </w:pPr>
+            <w:r>
+              <w:t xml:space="preserve">1886</w:t>
+            </w:r>
+          </w:p>
+        </w:tc>
+        <w:tc>
+          <w:tcPr>
+            <w:tcW w:w="1094" w:type="dxa"/>
+          </w:tcPr>
+          <w:p>
+            <w:pPr>
+              <w:jc w:val="center"/>
+            </w:pPr>
+            <w:r>
+              <w:t xml:space="preserve">1956</w:t>
+            </w:r>
+          </w:p>
+        </w:tc>
+        <w:tc>
+          <w:tcPr>
+            <w:tcW w:w="1029" w:type="dxa"/>
+          </w:tcPr>
+          <w:p>
+            <w:pPr>
+              <w:jc w:val="center"/>
+            </w:pPr>
+            <w:r>
+              <w:t xml:space="preserve">99.07%</w:t>
             </w:r>
           </w:p>
         </w:tc>
@@ -10911,6 +11219,1264 @@
         </w:tc>
       </w:tr>
     </w:tbl>
+    <w:p>
+      <w:r>
+        <w:rPr>
+          <w:b/>
+          <w:color w:val="1F4E78"/>
+          <w:sz w:val="26"/>
+        </w:rPr>
+        <w:t xml:space="preserve">8.4 v8-Chain — Energy-Aware CH-to-CH Relay (Closing the Far-BS Gap)</w:t>
+      </w:r>
+    </w:p>
+    <w:p>
+      <w:pPr>
+        <w:spacing w:after="120"/>
+        <w:rPr>
+          <w:rFonts w:ascii="Calibri" w:hAnsi="Calibri"/>
+          <w:sz w:val="22"/>
+          <w:rtl/>
+        </w:rPr>
+      </w:pPr>
+      <w:r>
+        <w:rPr>
+          <w:rFonts w:ascii="Calibri" w:hAnsi="Calibri"/>
+          <w:sz w:val="22"/>
+        </w:rPr>
+        <w:t xml:space="preserve">Section 8.3 showed that v8 is the best configuration for a center/near sink but that the v7 relay chain still gives the longer HND/LND at a far sink. v8-Chain adds one mechanism to v8: before forwarding, every CH compares the energy of sending its aggregated packet directly to the BS with the energy of handing it to another CH that is strictly closer to the BS (its transmission to that CH plus the relay CH's reception and aggregation cost). It relays only when that is cheaper. CHs are processed from the farthest to the nearest so relayed data is aggregated before it is forwarded, the relay path is recomputed every round from the CHs alive at that moment (so a promoted backup or a handover CH automatically takes its predecessor's place — chain repair with no extra messages), and the proactive-handover check includes the relay load. A v7-style ordered chain (every CH relays) was also tested for comparison.</w:t>
+      </w:r>
+    </w:p>
+    <w:p>
+      <w:pPr>
+        <w:spacing w:after="120"/>
+        <w:rPr>
+          <w:rFonts w:ascii="Calibri" w:hAnsi="Calibri"/>
+          <w:sz w:val="22"/>
+          <w:rtl/>
+        </w:rPr>
+      </w:pPr>
+      <w:r>
+        <w:rPr>
+          <w:rFonts w:ascii="Calibri" w:hAnsi="Calibri"/>
+          <w:sz w:val="22"/>
+        </w:rPr>
+        <w:t xml:space="preserve">Table 8.4 — Routing-mode comparison (seed 12345; 8-topology means in the note):</w:t>
+      </w:r>
+    </w:p>
+    <w:tbl>
+      <w:tblPr>
+        <w:tblW w:w="10673" w:type="dxa"/>
+        <w:tblInd w:w="-815" w:type="dxa"/>
+        <w:tblBorders>
+          <w:top w:val="single" w:sz="4" w:space="0" w:color="auto"/>
+          <w:left w:val="single" w:sz="4" w:space="0" w:color="auto"/>
+          <w:bottom w:val="single" w:sz="4" w:space="0" w:color="auto"/>
+          <w:right w:val="single" w:sz="4" w:space="0" w:color="auto"/>
+          <w:insideH w:val="single" w:sz="4" w:space="0" w:color="auto"/>
+          <w:insideV w:val="single" w:sz="4" w:space="0" w:color="auto"/>
+        </w:tblBorders>
+        <w:tblCellMar>
+          <w:left w:w="10" w:type="dxa"/>
+          <w:right w:w="10" w:type="dxa"/>
+        </w:tblCellMar>
+        <w:tblLook w:val="04A0" w:firstRow="1" w:lastRow="0" w:firstColumn="1" w:lastColumn="0" w:noHBand="0" w:noVBand="1"/>
+      </w:tblPr>
+      <w:tblGrid>
+        <w:gridCol w:w="2098"/>
+        <w:gridCol w:w="2048"/>
+        <w:gridCol w:w="1742"/>
+        <w:gridCol w:w="908"/>
+        <w:gridCol w:w="923"/>
+        <w:gridCol w:w="912"/>
+        <w:gridCol w:w="996"/>
+        <w:gridCol w:w="1046"/>
+      </w:tblGrid>
+      <w:tr>
+        <w:trPr>
+          <w:trHeight w:val="227"/>
+        </w:trPr>
+        <w:tc>
+          <w:tcPr>
+            <w:tcW w:w="2031" w:type="dxa"/>
+            <w:shd w:val="clear" w:color="auto" w:fill="1F4E78"/>
+          </w:tcPr>
+          <w:p>
+            <w:r>
+              <w:rPr>
+                <w:b/>
+                <w:color w:val="FFFFFF"/>
+                <w:sz w:val="21"/>
+              </w:rPr>
+              <w:t xml:space="preserve">Variant</w:t>
+            </w:r>
+          </w:p>
+        </w:tc>
+        <w:tc>
+          <w:tcPr>
+            <w:tcW w:w="2064" w:type="dxa"/>
+            <w:shd w:val="clear" w:color="auto" w:fill="1F4E78"/>
+          </w:tcPr>
+          <w:p>
+            <w:r>
+              <w:rPr>
+                <w:b/>
+                <w:color w:val="FFFFFF"/>
+                <w:sz w:val="21"/>
+              </w:rPr>
+              <w:t xml:space="preserve">CH routing</w:t>
+            </w:r>
+          </w:p>
+        </w:tc>
+        <w:tc>
+          <w:tcPr>
+            <w:tcW w:w="1753" w:type="dxa"/>
+            <w:shd w:val="clear" w:color="auto" w:fill="1F4E78"/>
+          </w:tcPr>
+          <w:p>
+            <w:r>
+              <w:rPr>
+                <w:b/>
+                <w:color w:val="FFFFFF"/>
+                <w:sz w:val="21"/>
+              </w:rPr>
+              <w:t xml:space="preserve">Environment</w:t>
+            </w:r>
+          </w:p>
+        </w:tc>
+        <w:tc>
+          <w:tcPr>
+            <w:tcW w:w="917" w:type="dxa"/>
+            <w:shd w:val="clear" w:color="auto" w:fill="1F4E78"/>
+          </w:tcPr>
+          <w:p>
+            <w:pPr>
+              <w:jc w:val="center"/>
+            </w:pPr>
+            <w:r>
+              <w:rPr>
+                <w:b/>
+                <w:color w:val="FFFFFF"/>
+                <w:sz w:val="21"/>
+              </w:rPr>
+              <w:t xml:space="preserve">FND</w:t>
+            </w:r>
+          </w:p>
+        </w:tc>
+        <w:tc>
+          <w:tcPr>
+            <w:tcW w:w="932" w:type="dxa"/>
+            <w:shd w:val="clear" w:color="auto" w:fill="1F4E78"/>
+          </w:tcPr>
+          <w:p>
+            <w:pPr>
+              <w:jc w:val="center"/>
+            </w:pPr>
+            <w:r>
+              <w:rPr>
+                <w:b/>
+                <w:color w:val="FFFFFF"/>
+                <w:sz w:val="21"/>
+              </w:rPr>
+              <w:t xml:space="preserve">HND</w:t>
+            </w:r>
+          </w:p>
+        </w:tc>
+        <w:tc>
+          <w:tcPr>
+            <w:tcW w:w="921" w:type="dxa"/>
+            <w:shd w:val="clear" w:color="auto" w:fill="1F4E78"/>
+          </w:tcPr>
+          <w:p>
+            <w:pPr>
+              <w:jc w:val="center"/>
+            </w:pPr>
+            <w:r>
+              <w:rPr>
+                <w:b/>
+                <w:color w:val="FFFFFF"/>
+                <w:sz w:val="21"/>
+              </w:rPr>
+              <w:t xml:space="preserve">LND</w:t>
+            </w:r>
+          </w:p>
+        </w:tc>
+        <w:tc>
+          <w:tcPr>
+            <w:tcW w:w="1003" w:type="dxa"/>
+            <w:shd w:val="clear" w:color="auto" w:fill="1F4E78"/>
+          </w:tcPr>
+          <w:p>
+            <w:pPr>
+              <w:jc w:val="center"/>
+            </w:pPr>
+            <w:r>
+              <w:rPr>
+                <w:b/>
+                <w:color w:val="FFFFFF"/>
+                <w:sz w:val="21"/>
+              </w:rPr>
+              <w:t xml:space="preserve">PDR</w:t>
+            </w:r>
+          </w:p>
+        </w:tc>
+        <w:tc>
+          <w:tcPr>
+            <w:tcW w:w="1052" w:type="dxa"/>
+            <w:shd w:val="clear" w:color="auto" w:fill="1F4E78"/>
+          </w:tcPr>
+          <w:p>
+            <w:pPr>
+              <w:jc w:val="center"/>
+            </w:pPr>
+            <w:r>
+              <w:rPr>
+                <w:b/>
+                <w:color w:val="FFFFFF"/>
+                <w:sz w:val="21"/>
+              </w:rPr>
+              <w:t xml:space="preserve">Relays</w:t>
+            </w:r>
+          </w:p>
+        </w:tc>
+      </w:tr>
+      <w:tr>
+        <w:trPr>
+          <w:trHeight w:val="650"/>
+        </w:trPr>
+        <w:tc>
+          <w:tcPr>
+            <w:tcW w:w="2031" w:type="dxa"/>
+            <w:shd w:val="clear" w:color="auto" w:fill="F2F6F8"/>
+          </w:tcPr>
+          <w:p>
+            <w:r>
+              <w:t xml:space="preserve">v7_center</w:t>
+            </w:r>
+          </w:p>
+        </w:tc>
+        <w:tc>
+          <w:tcPr>
+            <w:tcW w:w="2064" w:type="dxa"/>
+            <w:shd w:val="clear" w:color="auto" w:fill="F2F6F8"/>
+          </w:tcPr>
+          <w:p>
+            <w:r>
+              <w:t xml:space="preserve">Ordered chain</w:t>
+            </w:r>
+          </w:p>
+        </w:tc>
+        <w:tc>
+          <w:tcPr>
+            <w:tcW w:w="1753" w:type="dxa"/>
+            <w:shd w:val="clear" w:color="auto" w:fill="F2F6F8"/>
+          </w:tcPr>
+          <w:p>
+            <w:r>
+              <w:t xml:space="preserve">BS center (50,50)</w:t>
+            </w:r>
+          </w:p>
+        </w:tc>
+        <w:tc>
+          <w:tcPr>
+            <w:tcW w:w="917" w:type="dxa"/>
+            <w:shd w:val="clear" w:color="auto" w:fill="F2F6F8"/>
+          </w:tcPr>
+          <w:p>
+            <w:pPr>
+              <w:jc w:val="center"/>
+            </w:pPr>
+            <w:r>
+              <w:t xml:space="preserve">1551</w:t>
+            </w:r>
+          </w:p>
+        </w:tc>
+        <w:tc>
+          <w:tcPr>
+            <w:tcW w:w="932" w:type="dxa"/>
+            <w:shd w:val="clear" w:color="auto" w:fill="F2F6F8"/>
+          </w:tcPr>
+          <w:p>
+            <w:pPr>
+              <w:jc w:val="center"/>
+            </w:pPr>
+            <w:r>
+              <w:t xml:space="preserve">1976</w:t>
+            </w:r>
+          </w:p>
+        </w:tc>
+        <w:tc>
+          <w:tcPr>
+            <w:tcW w:w="921" w:type="dxa"/>
+            <w:shd w:val="clear" w:color="auto" w:fill="F2F6F8"/>
+          </w:tcPr>
+          <w:p>
+            <w:pPr>
+              <w:jc w:val="center"/>
+            </w:pPr>
+            <w:r>
+              <w:t xml:space="preserve">2066</w:t>
+            </w:r>
+          </w:p>
+        </w:tc>
+        <w:tc>
+          <w:tcPr>
+            <w:tcW w:w="1003" w:type="dxa"/>
+            <w:shd w:val="clear" w:color="auto" w:fill="F2F6F8"/>
+          </w:tcPr>
+          <w:p>
+            <w:pPr>
+              <w:jc w:val="center"/>
+            </w:pPr>
+            <w:r>
+              <w:t xml:space="preserve">98.43%</w:t>
+            </w:r>
+          </w:p>
+        </w:tc>
+        <w:tc>
+          <w:tcPr>
+            <w:tcW w:w="1052" w:type="dxa"/>
+            <w:shd w:val="clear" w:color="auto" w:fill="F2F6F8"/>
+          </w:tcPr>
+          <w:p>
+            <w:pPr>
+              <w:jc w:val="center"/>
+            </w:pPr>
+            <w:r>
+              <w:t xml:space="preserve">—</w:t>
+            </w:r>
+          </w:p>
+        </w:tc>
+      </w:tr>
+      <w:tr>
+        <w:trPr>
+          <w:trHeight w:val="661"/>
+        </w:trPr>
+        <w:tc>
+          <w:tcPr>
+            <w:tcW w:w="2031" w:type="dxa"/>
+            <w:shd w:val="clear" w:color="auto" w:fill="F2F6F8"/>
+          </w:tcPr>
+          <w:p>
+            <w:r>
+              <w:t xml:space="preserve">v8_center</w:t>
+            </w:r>
+          </w:p>
+        </w:tc>
+        <w:tc>
+          <w:tcPr>
+            <w:tcW w:w="2064" w:type="dxa"/>
+            <w:shd w:val="clear" w:color="auto" w:fill="F2F6F8"/>
+          </w:tcPr>
+          <w:p>
+            <w:r>
+              <w:t xml:space="preserve">Direct CH→BS</w:t>
+            </w:r>
+          </w:p>
+        </w:tc>
+        <w:tc>
+          <w:tcPr>
+            <w:tcW w:w="1753" w:type="dxa"/>
+            <w:shd w:val="clear" w:color="auto" w:fill="F2F6F8"/>
+          </w:tcPr>
+          <w:p>
+            <w:r>
+              <w:t xml:space="preserve">BS center (50,50)</w:t>
+            </w:r>
+          </w:p>
+        </w:tc>
+        <w:tc>
+          <w:tcPr>
+            <w:tcW w:w="917" w:type="dxa"/>
+            <w:shd w:val="clear" w:color="auto" w:fill="F2F6F8"/>
+          </w:tcPr>
+          <w:p>
+            <w:pPr>
+              <w:jc w:val="center"/>
+            </w:pPr>
+            <w:r>
+              <w:t xml:space="preserve">2621</w:t>
+            </w:r>
+          </w:p>
+        </w:tc>
+        <w:tc>
+          <w:tcPr>
+            <w:tcW w:w="932" w:type="dxa"/>
+            <w:shd w:val="clear" w:color="auto" w:fill="F2F6F8"/>
+          </w:tcPr>
+          <w:p>
+            <w:pPr>
+              <w:jc w:val="center"/>
+            </w:pPr>
+            <w:r>
+              <w:t xml:space="preserve">2711</w:t>
+            </w:r>
+          </w:p>
+        </w:tc>
+        <w:tc>
+          <w:tcPr>
+            <w:tcW w:w="921" w:type="dxa"/>
+            <w:shd w:val="clear" w:color="auto" w:fill="F2F6F8"/>
+          </w:tcPr>
+          <w:p>
+            <w:pPr>
+              <w:jc w:val="center"/>
+            </w:pPr>
+            <w:r>
+              <w:t xml:space="preserve">2761</w:t>
+            </w:r>
+          </w:p>
+        </w:tc>
+        <w:tc>
+          <w:tcPr>
+            <w:tcW w:w="1003" w:type="dxa"/>
+            <w:shd w:val="clear" w:color="auto" w:fill="F2F6F8"/>
+          </w:tcPr>
+          <w:p>
+            <w:pPr>
+              <w:jc w:val="center"/>
+            </w:pPr>
+            <w:r>
+              <w:t xml:space="preserve">99.22%</w:t>
+            </w:r>
+          </w:p>
+        </w:tc>
+        <w:tc>
+          <w:tcPr>
+            <w:tcW w:w="1052" w:type="dxa"/>
+            <w:shd w:val="clear" w:color="auto" w:fill="F2F6F8"/>
+          </w:tcPr>
+          <w:p>
+            <w:pPr>
+              <w:jc w:val="center"/>
+            </w:pPr>
+            <w:r>
+              <w:t xml:space="preserve">0</w:t>
+            </w:r>
+          </w:p>
+        </w:tc>
+      </w:tr>
+      <w:tr>
+        <w:trPr>
+          <w:trHeight w:val="650"/>
+        </w:trPr>
+        <w:tc>
+          <w:tcPr>
+            <w:tcW w:w="2031" w:type="dxa"/>
+            <w:shd w:val="clear" w:color="auto" w:fill="F2F6F8"/>
+          </w:tcPr>
+          <w:p>
+            <w:r>
+              <w:t xml:space="preserve">v8_orderedChain_center</w:t>
+            </w:r>
+          </w:p>
+        </w:tc>
+        <w:tc>
+          <w:tcPr>
+            <w:tcW w:w="2064" w:type="dxa"/>
+            <w:shd w:val="clear" w:color="auto" w:fill="F2F6F8"/>
+          </w:tcPr>
+          <w:p>
+            <w:r>
+              <w:t xml:space="preserve">Ordered chain (all CHs relay)</w:t>
+            </w:r>
+          </w:p>
+        </w:tc>
+        <w:tc>
+          <w:tcPr>
+            <w:tcW w:w="1753" w:type="dxa"/>
+            <w:shd w:val="clear" w:color="auto" w:fill="F2F6F8"/>
+          </w:tcPr>
+          <w:p>
+            <w:r>
+              <w:t xml:space="preserve">BS center (50,50)</w:t>
+            </w:r>
+          </w:p>
+        </w:tc>
+        <w:tc>
+          <w:tcPr>
+            <w:tcW w:w="917" w:type="dxa"/>
+            <w:shd w:val="clear" w:color="auto" w:fill="F2F6F8"/>
+          </w:tcPr>
+          <w:p>
+            <w:pPr>
+              <w:jc w:val="center"/>
+            </w:pPr>
+            <w:r>
+              <w:t xml:space="preserve">2566</w:t>
+            </w:r>
+          </w:p>
+        </w:tc>
+        <w:tc>
+          <w:tcPr>
+            <w:tcW w:w="932" w:type="dxa"/>
+            <w:shd w:val="clear" w:color="auto" w:fill="F2F6F8"/>
+          </w:tcPr>
+          <w:p>
+            <w:pPr>
+              <w:jc w:val="center"/>
+            </w:pPr>
+            <w:r>
+              <w:t xml:space="preserve">2661</w:t>
+            </w:r>
+          </w:p>
+        </w:tc>
+        <w:tc>
+          <w:tcPr>
+            <w:tcW w:w="921" w:type="dxa"/>
+            <w:shd w:val="clear" w:color="auto" w:fill="F2F6F8"/>
+          </w:tcPr>
+          <w:p>
+            <w:pPr>
+              <w:jc w:val="center"/>
+            </w:pPr>
+            <w:r>
+              <w:t xml:space="preserve">2692</w:t>
+            </w:r>
+          </w:p>
+        </w:tc>
+        <w:tc>
+          <w:tcPr>
+            <w:tcW w:w="1003" w:type="dxa"/>
+            <w:shd w:val="clear" w:color="auto" w:fill="F2F6F8"/>
+          </w:tcPr>
+          <w:p>
+            <w:pPr>
+              <w:jc w:val="center"/>
+            </w:pPr>
+            <w:r>
+              <w:t xml:space="preserve">99.11%</w:t>
+            </w:r>
+          </w:p>
+        </w:tc>
+        <w:tc>
+          <w:tcPr>
+            <w:tcW w:w="1052" w:type="dxa"/>
+            <w:shd w:val="clear" w:color="auto" w:fill="F2F6F8"/>
+          </w:tcPr>
+          <w:p>
+            <w:pPr>
+              <w:jc w:val="center"/>
+            </w:pPr>
+            <w:r>
+              <w:t xml:space="preserve">6,485</w:t>
+            </w:r>
+          </w:p>
+        </w:tc>
+      </w:tr>
+      <w:tr>
+        <w:trPr>
+          <w:trHeight w:val="661"/>
+        </w:trPr>
+        <w:tc>
+          <w:tcPr>
+            <w:tcW w:w="2031" w:type="dxa"/>
+            <w:shd w:val="clear" w:color="auto" w:fill="F2F6F8"/>
+          </w:tcPr>
+          <w:p>
+            <w:r>
+              <w:t xml:space="preserve">v8-Chain_center</w:t>
+            </w:r>
+          </w:p>
+        </w:tc>
+        <w:tc>
+          <w:tcPr>
+            <w:tcW w:w="2064" w:type="dxa"/>
+            <w:shd w:val="clear" w:color="auto" w:fill="F2F6F8"/>
+          </w:tcPr>
+          <w:p>
+            <w:r>
+              <w:t xml:space="preserve">Energy-aware relay</w:t>
+            </w:r>
+          </w:p>
+        </w:tc>
+        <w:tc>
+          <w:tcPr>
+            <w:tcW w:w="1753" w:type="dxa"/>
+            <w:shd w:val="clear" w:color="auto" w:fill="F2F6F8"/>
+          </w:tcPr>
+          <w:p>
+            <w:r>
+              <w:t xml:space="preserve">BS center (50,50)</w:t>
+            </w:r>
+          </w:p>
+        </w:tc>
+        <w:tc>
+          <w:tcPr>
+            <w:tcW w:w="917" w:type="dxa"/>
+            <w:shd w:val="clear" w:color="auto" w:fill="F2F6F8"/>
+          </w:tcPr>
+          <w:p>
+            <w:pPr>
+              <w:jc w:val="center"/>
+            </w:pPr>
+            <w:r>
+              <w:t xml:space="preserve">2621</w:t>
+            </w:r>
+          </w:p>
+        </w:tc>
+        <w:tc>
+          <w:tcPr>
+            <w:tcW w:w="932" w:type="dxa"/>
+            <w:shd w:val="clear" w:color="auto" w:fill="F2F6F8"/>
+          </w:tcPr>
+          <w:p>
+            <w:pPr>
+              <w:jc w:val="center"/>
+            </w:pPr>
+            <w:r>
+              <w:t xml:space="preserve">2711</w:t>
+            </w:r>
+          </w:p>
+        </w:tc>
+        <w:tc>
+          <w:tcPr>
+            <w:tcW w:w="921" w:type="dxa"/>
+            <w:shd w:val="clear" w:color="auto" w:fill="F2F6F8"/>
+          </w:tcPr>
+          <w:p>
+            <w:pPr>
+              <w:jc w:val="center"/>
+            </w:pPr>
+            <w:r>
+              <w:t xml:space="preserve">2756</w:t>
+            </w:r>
+          </w:p>
+        </w:tc>
+        <w:tc>
+          <w:tcPr>
+            <w:tcW w:w="1003" w:type="dxa"/>
+            <w:shd w:val="clear" w:color="auto" w:fill="F2F6F8"/>
+          </w:tcPr>
+          <w:p>
+            <w:pPr>
+              <w:jc w:val="center"/>
+            </w:pPr>
+            <w:r>
+              <w:t xml:space="preserve">99.27%</w:t>
+            </w:r>
+          </w:p>
+        </w:tc>
+        <w:tc>
+          <w:tcPr>
+            <w:tcW w:w="1052" w:type="dxa"/>
+            <w:shd w:val="clear" w:color="auto" w:fill="F2F6F8"/>
+          </w:tcPr>
+          <w:p>
+            <w:pPr>
+              <w:jc w:val="center"/>
+            </w:pPr>
+            <w:r>
+              <w:t xml:space="preserve">0</w:t>
+            </w:r>
+          </w:p>
+        </w:tc>
+      </w:tr>
+      <w:tr>
+        <w:trPr>
+          <w:trHeight w:val="650"/>
+        </w:trPr>
+        <w:tc>
+          <w:tcPr>
+            <w:tcW w:w="2031" w:type="dxa"/>
+            <w:shd w:val="clear" w:color="auto" w:fill="F2F6F8"/>
+          </w:tcPr>
+          <w:p>
+            <w:r>
+              <w:t xml:space="preserve">v7_farBS_v2</w:t>
+            </w:r>
+          </w:p>
+        </w:tc>
+        <w:tc>
+          <w:tcPr>
+            <w:tcW w:w="2064" w:type="dxa"/>
+            <w:shd w:val="clear" w:color="auto" w:fill="F2F6F8"/>
+          </w:tcPr>
+          <w:p>
+            <w:r>
+              <w:t xml:space="preserve">Ordered chain</w:t>
+            </w:r>
+          </w:p>
+        </w:tc>
+        <w:tc>
+          <w:tcPr>
+            <w:tcW w:w="1753" w:type="dxa"/>
+            <w:shd w:val="clear" w:color="auto" w:fill="F2F6F8"/>
+          </w:tcPr>
+          <w:p>
+            <w:r>
+              <w:t xml:space="preserve">BS far (50,-100)</w:t>
+            </w:r>
+          </w:p>
+        </w:tc>
+        <w:tc>
+          <w:tcPr>
+            <w:tcW w:w="917" w:type="dxa"/>
+            <w:shd w:val="clear" w:color="auto" w:fill="F2F6F8"/>
+          </w:tcPr>
+          <w:p>
+            <w:pPr>
+              <w:jc w:val="center"/>
+            </w:pPr>
+            <w:r>
+              <w:t xml:space="preserve">1266</w:t>
+            </w:r>
+          </w:p>
+        </w:tc>
+        <w:tc>
+          <w:tcPr>
+            <w:tcW w:w="932" w:type="dxa"/>
+            <w:shd w:val="clear" w:color="auto" w:fill="F2F6F8"/>
+          </w:tcPr>
+          <w:p>
+            <w:pPr>
+              <w:jc w:val="center"/>
+            </w:pPr>
+            <w:r>
+              <w:t xml:space="preserve">1891</w:t>
+            </w:r>
+          </w:p>
+        </w:tc>
+        <w:tc>
+          <w:tcPr>
+            <w:tcW w:w="921" w:type="dxa"/>
+            <w:shd w:val="clear" w:color="auto" w:fill="F2F6F8"/>
+          </w:tcPr>
+          <w:p>
+            <w:pPr>
+              <w:jc w:val="center"/>
+            </w:pPr>
+            <w:r>
+              <w:t xml:space="preserve">1976</w:t>
+            </w:r>
+          </w:p>
+        </w:tc>
+        <w:tc>
+          <w:tcPr>
+            <w:tcW w:w="1003" w:type="dxa"/>
+            <w:shd w:val="clear" w:color="auto" w:fill="F2F6F8"/>
+          </w:tcPr>
+          <w:p>
+            <w:pPr>
+              <w:jc w:val="center"/>
+            </w:pPr>
+            <w:r>
+              <w:t xml:space="preserve">98.14%</w:t>
+            </w:r>
+          </w:p>
+        </w:tc>
+        <w:tc>
+          <w:tcPr>
+            <w:tcW w:w="1052" w:type="dxa"/>
+            <w:shd w:val="clear" w:color="auto" w:fill="F2F6F8"/>
+          </w:tcPr>
+          <w:p>
+            <w:pPr>
+              <w:jc w:val="center"/>
+            </w:pPr>
+            <w:r>
+              <w:t xml:space="preserve">—</w:t>
+            </w:r>
+          </w:p>
+        </w:tc>
+      </w:tr>
+      <w:tr>
+        <w:trPr>
+          <w:trHeight w:val="661"/>
+        </w:trPr>
+        <w:tc>
+          <w:tcPr>
+            <w:tcW w:w="2031" w:type="dxa"/>
+            <w:shd w:val="clear" w:color="auto" w:fill="F2F6F8"/>
+          </w:tcPr>
+          <w:p>
+            <w:r>
+              <w:t xml:space="preserve">v8_farBS</w:t>
+            </w:r>
+          </w:p>
+        </w:tc>
+        <w:tc>
+          <w:tcPr>
+            <w:tcW w:w="2064" w:type="dxa"/>
+            <w:shd w:val="clear" w:color="auto" w:fill="F2F6F8"/>
+          </w:tcPr>
+          <w:p>
+            <w:r>
+              <w:t xml:space="preserve">Direct CH→BS</w:t>
+            </w:r>
+          </w:p>
+        </w:tc>
+        <w:tc>
+          <w:tcPr>
+            <w:tcW w:w="1753" w:type="dxa"/>
+            <w:shd w:val="clear" w:color="auto" w:fill="F2F6F8"/>
+          </w:tcPr>
+          <w:p>
+            <w:r>
+              <w:t xml:space="preserve">BS far (50,-100)</w:t>
+            </w:r>
+          </w:p>
+        </w:tc>
+        <w:tc>
+          <w:tcPr>
+            <w:tcW w:w="917" w:type="dxa"/>
+            <w:shd w:val="clear" w:color="auto" w:fill="F2F6F8"/>
+          </w:tcPr>
+          <w:p>
+            <w:pPr>
+              <w:jc w:val="center"/>
+            </w:pPr>
+            <w:r>
+              <w:t xml:space="preserve">1471</w:t>
+            </w:r>
+          </w:p>
+        </w:tc>
+        <w:tc>
+          <w:tcPr>
+            <w:tcW w:w="932" w:type="dxa"/>
+            <w:shd w:val="clear" w:color="auto" w:fill="F2F6F8"/>
+          </w:tcPr>
+          <w:p>
+            <w:pPr>
+              <w:jc w:val="center"/>
+            </w:pPr>
+            <w:r>
+              <w:t xml:space="preserve">1646</w:t>
+            </w:r>
+          </w:p>
+        </w:tc>
+        <w:tc>
+          <w:tcPr>
+            <w:tcW w:w="921" w:type="dxa"/>
+            <w:shd w:val="clear" w:color="auto" w:fill="F2F6F8"/>
+          </w:tcPr>
+          <w:p>
+            <w:pPr>
+              <w:jc w:val="center"/>
+            </w:pPr>
+            <w:r>
+              <w:t xml:space="preserve">1716</w:t>
+            </w:r>
+          </w:p>
+        </w:tc>
+        <w:tc>
+          <w:tcPr>
+            <w:tcW w:w="1003" w:type="dxa"/>
+            <w:shd w:val="clear" w:color="auto" w:fill="F2F6F8"/>
+          </w:tcPr>
+          <w:p>
+            <w:pPr>
+              <w:jc w:val="center"/>
+            </w:pPr>
+            <w:r>
+              <w:t xml:space="preserve">98.66%</w:t>
+            </w:r>
+          </w:p>
+        </w:tc>
+        <w:tc>
+          <w:tcPr>
+            <w:tcW w:w="1052" w:type="dxa"/>
+            <w:shd w:val="clear" w:color="auto" w:fill="F2F6F8"/>
+          </w:tcPr>
+          <w:p>
+            <w:pPr>
+              <w:jc w:val="center"/>
+            </w:pPr>
+            <w:r>
+              <w:t xml:space="preserve">0</w:t>
+            </w:r>
+          </w:p>
+        </w:tc>
+      </w:tr>
+      <w:tr>
+        <w:trPr>
+          <w:trHeight w:val="650"/>
+        </w:trPr>
+        <w:tc>
+          <w:tcPr>
+            <w:tcW w:w="2031" w:type="dxa"/>
+            <w:shd w:val="clear" w:color="auto" w:fill="F2F6F8"/>
+          </w:tcPr>
+          <w:p>
+            <w:r>
+              <w:t xml:space="preserve">v8_orderedChain_farBS</w:t>
+            </w:r>
+          </w:p>
+        </w:tc>
+        <w:tc>
+          <w:tcPr>
+            <w:tcW w:w="2064" w:type="dxa"/>
+            <w:shd w:val="clear" w:color="auto" w:fill="F2F6F8"/>
+          </w:tcPr>
+          <w:p>
+            <w:r>
+              <w:t xml:space="preserve">Ordered chain (all CHs relay)</w:t>
+            </w:r>
+          </w:p>
+        </w:tc>
+        <w:tc>
+          <w:tcPr>
+            <w:tcW w:w="1753" w:type="dxa"/>
+            <w:shd w:val="clear" w:color="auto" w:fill="F2F6F8"/>
+          </w:tcPr>
+          <w:p>
+            <w:r>
+              <w:t xml:space="preserve">BS far (50,-100)</w:t>
+            </w:r>
+          </w:p>
+        </w:tc>
+        <w:tc>
+          <w:tcPr>
+            <w:tcW w:w="917" w:type="dxa"/>
+            <w:shd w:val="clear" w:color="auto" w:fill="F2F6F8"/>
+          </w:tcPr>
+          <w:p>
+            <w:pPr>
+              <w:jc w:val="center"/>
+            </w:pPr>
+            <w:r>
+              <w:t xml:space="preserve">1696</w:t>
+            </w:r>
+          </w:p>
+        </w:tc>
+        <w:tc>
+          <w:tcPr>
+            <w:tcW w:w="932" w:type="dxa"/>
+            <w:shd w:val="clear" w:color="auto" w:fill="F2F6F8"/>
+          </w:tcPr>
+          <w:p>
+            <w:pPr>
+              <w:jc w:val="center"/>
+            </w:pPr>
+            <w:r>
+              <w:t xml:space="preserve">1901</w:t>
+            </w:r>
+          </w:p>
+        </w:tc>
+        <w:tc>
+          <w:tcPr>
+            <w:tcW w:w="921" w:type="dxa"/>
+            <w:shd w:val="clear" w:color="auto" w:fill="F2F6F8"/>
+          </w:tcPr>
+          <w:p>
+            <w:pPr>
+              <w:jc w:val="center"/>
+            </w:pPr>
+            <w:r>
+              <w:t xml:space="preserve">1961</w:t>
+            </w:r>
+          </w:p>
+        </w:tc>
+        <w:tc>
+          <w:tcPr>
+            <w:tcW w:w="1003" w:type="dxa"/>
+            <w:shd w:val="clear" w:color="auto" w:fill="F2F6F8"/>
+          </w:tcPr>
+          <w:p>
+            <w:pPr>
+              <w:jc w:val="center"/>
+            </w:pPr>
+            <w:r>
+              <w:t xml:space="preserve">99.03%</w:t>
+            </w:r>
+          </w:p>
+        </w:tc>
+        <w:tc>
+          <w:tcPr>
+            <w:tcW w:w="1052" w:type="dxa"/>
+            <w:shd w:val="clear" w:color="auto" w:fill="F2F6F8"/>
+          </w:tcPr>
+          <w:p>
+            <w:pPr>
+              <w:jc w:val="center"/>
+            </w:pPr>
+            <w:r>
+              <w:t xml:space="preserve">4,805</w:t>
+            </w:r>
+          </w:p>
+        </w:tc>
+      </w:tr>
+      <w:tr>
+        <w:trPr>
+          <w:trHeight w:val="661"/>
+        </w:trPr>
+        <w:tc>
+          <w:tcPr>
+            <w:tcW w:w="2031" w:type="dxa"/>
+            <w:shd w:val="clear" w:color="auto" w:fill="F2F6F8"/>
+          </w:tcPr>
+          <w:p>
+            <w:r>
+              <w:t xml:space="preserve">v8-Chain_farBS</w:t>
+            </w:r>
+          </w:p>
+        </w:tc>
+        <w:tc>
+          <w:tcPr>
+            <w:tcW w:w="2064" w:type="dxa"/>
+            <w:shd w:val="clear" w:color="auto" w:fill="F2F6F8"/>
+          </w:tcPr>
+          <w:p>
+            <w:r>
+              <w:t xml:space="preserve">Energy-aware relay</w:t>
+            </w:r>
+          </w:p>
+        </w:tc>
+        <w:tc>
+          <w:tcPr>
+            <w:tcW w:w="1753" w:type="dxa"/>
+            <w:shd w:val="clear" w:color="auto" w:fill="F2F6F8"/>
+          </w:tcPr>
+          <w:p>
+            <w:r>
+              <w:t xml:space="preserve">BS far (50,-100)</w:t>
+            </w:r>
+          </w:p>
+        </w:tc>
+        <w:tc>
+          <w:tcPr>
+            <w:tcW w:w="917" w:type="dxa"/>
+            <w:shd w:val="clear" w:color="auto" w:fill="F2F6F8"/>
+          </w:tcPr>
+          <w:p>
+            <w:pPr>
+              <w:jc w:val="center"/>
+            </w:pPr>
+            <w:r>
+              <w:t xml:space="preserve">1716</w:t>
+            </w:r>
+          </w:p>
+        </w:tc>
+        <w:tc>
+          <w:tcPr>
+            <w:tcW w:w="932" w:type="dxa"/>
+            <w:shd w:val="clear" w:color="auto" w:fill="F2F6F8"/>
+          </w:tcPr>
+          <w:p>
+            <w:pPr>
+              <w:jc w:val="center"/>
+            </w:pPr>
+            <w:r>
+              <w:t xml:space="preserve">1886</w:t>
+            </w:r>
+          </w:p>
+        </w:tc>
+        <w:tc>
+          <w:tcPr>
+            <w:tcW w:w="921" w:type="dxa"/>
+            <w:shd w:val="clear" w:color="auto" w:fill="F2F6F8"/>
+          </w:tcPr>
+          <w:p>
+            <w:pPr>
+              <w:jc w:val="center"/>
+            </w:pPr>
+            <w:r>
+              <w:t xml:space="preserve">1956</w:t>
+            </w:r>
+          </w:p>
+        </w:tc>
+        <w:tc>
+          <w:tcPr>
+            <w:tcW w:w="1003" w:type="dxa"/>
+            <w:shd w:val="clear" w:color="auto" w:fill="F2F6F8"/>
+          </w:tcPr>
+          <w:p>
+            <w:pPr>
+              <w:jc w:val="center"/>
+            </w:pPr>
+            <w:r>
+              <w:t xml:space="preserve">99.07%</w:t>
+            </w:r>
+          </w:p>
+        </w:tc>
+        <w:tc>
+          <w:tcPr>
+            <w:tcW w:w="1052" w:type="dxa"/>
+            <w:shd w:val="clear" w:color="auto" w:fill="F2F6F8"/>
+          </w:tcPr>
+          <w:p>
+            <w:pPr>
+              <w:jc w:val="center"/>
+            </w:pPr>
+            <w:r>
+              <w:t xml:space="preserve">4,710</w:t>
+            </w:r>
+          </w:p>
+        </w:tc>
+      </w:tr>
+    </w:tbl>
+    <w:p>
+      <w:pPr>
+        <w:spacing w:after="120"/>
+        <w:rPr>
+          <w:rFonts w:ascii="Calibri" w:hAnsi="Calibri"/>
+          <w:sz w:val="22"/>
+          <w:rtl/>
+        </w:rPr>
+      </w:pPr>
+      <w:r>
+        <w:rPr>
+          <w:rFonts w:ascii="Calibri" w:hAnsi="Calibri"/>
+          <w:sz w:val="22"/>
+        </w:rPr>
+        <w:t xml:space="preserve">Mean of 8 random topologies — v8-Chain: center 2618 / 2720 / 2765 / 99.25%, far 1743 / 1932 / 1995 / 99.05%; ordered chain: center 2571 / 2664 / 2704 / 99.22%, far 1740 / 1932 / 1992 / 99.07%. At the far BS, v8-Chain reached an LND at least equal to v7's 1976 in 6 of the 8 topologies.</w:t>
+      </w:r>
+    </w:p>
+    <w:tbl>
+      <w:tblPr>
+        <w:tblW w:w="0" w:type="auto"/>
+        <w:tblCellMar>
+          <w:left w:w="10" w:type="dxa"/>
+          <w:right w:w="10" w:type="dxa"/>
+        </w:tblCellMar>
+        <w:tblLook w:val="04A0" w:firstRow="1" w:lastRow="0" w:firstColumn="1" w:lastColumn="0" w:noHBand="0" w:noVBand="1"/>
+      </w:tblPr>
+      <w:tblGrid>
+        <w:gridCol w:w="9026"/>
+      </w:tblGrid>
+      <w:tr>
+        <w:tc>
+          <w:tcPr>
+            <w:tcW w:w="9026" w:type="dxa"/>
+            <w:shd w:val="clear" w:color="auto" w:fill="EAF6EF"/>
+          </w:tcPr>
+          <w:p>
+            <w:r>
+              <w:t xml:space="preserve">WHY these results happened: with the sink at the field center, every CH is at most ~50 m from the BS and a relay would add the next CH's reception and aggregation energy without saving much transmission energy, so the energy-aware rule never relays and v8-Chain behaves exactly like v8 (forcing an ordered chain there costs ~55 rounds of FND). With the sink 100 m outside the field, a CH's direct transmission covers 100–200 m, far above d0 ≈ 88 m where the d⁴ multipath term dominates; splitting that distance into short CH-to-CH hops is much cheaper, so the rule forms a chain on its own. Compared with v8 at the far BS this adds ~245 rounds to FND, HND and LND and +0.4 pp PDR; compared with the v7 chain it keeps FND 36% higher (1716 vs 1266) and PDR higher (99.07% vs 98.14%) while HND/LND become practically equal (1886/1956 vs 1891/1976). One configuration therefore performs at or near the best in both sink placements, instead of choosing v8 for a center sink and v7 for a far sink.</w:t>
+            </w:r>
+          </w:p>
+        </w:tc>
+      </w:tr>
+    </w:tbl>
+    <w:p>
+      <w:pPr>
+        <w:spacing w:after="120"/>
+        <w:jc w:val="center"/>
+        <w:rPr>
+          <w:rFonts w:ascii="Calibri" w:hAnsi="Calibri"/>
+          <w:sz w:val="22"/>
+          <w:rtl/>
+        </w:rPr>
+      </w:pPr>
+      <w:r>
+        <w:drawing>
+          <wp:inline xmlns:a="http://schemas.openxmlformats.org/drawingml/2006/main" xmlns:pic="http://schemas.openxmlformats.org/drawingml/2006/picture">
+            <wp:extent cx="4206240" cy="6580912"/>
+            <wp:docPr id="1" name="Picture 1"/>
+            <wp:cNvGraphicFramePr>
+              <a:graphicFrameLocks noChangeAspect="1"/>
+            </wp:cNvGraphicFramePr>
+            <a:graphic>
+              <a:graphicData uri="http://schemas.openxmlformats.org/drawingml/2006/picture">
+                <pic:pic>
+                  <pic:nvPicPr>
+                    <pic:cNvPr id="0" name="v8_chain_flowchart.png"/>
+                    <pic:cNvPicPr/>
+                  </pic:nvPicPr>
+                  <pic:blipFill>
+                    <a:blip r:embed="rId7"/>
+                    <a:stretch>
+                      <a:fillRect/>
+                    </a:stretch>
+                  </pic:blipFill>
+                  <pic:spPr>
+                    <a:xfrm>
+                      <a:off x="0" y="0"/>
+                      <a:ext cx="4206240" cy="6580912"/>
+                    </a:xfrm>
+                    <a:prstGeom prst="rect"/>
+                  </pic:spPr>
+                </pic:pic>
+              </a:graphicData>
+            </a:graphic>
+          </wp:inline>
+        </w:drawing>
+      </w:r>
+    </w:p>
+    <w:p>
+      <w:pPr>
+        <w:spacing w:after="120"/>
+        <w:jc w:val="center"/>
+        <w:rPr>
+          <w:rFonts w:ascii="Calibri" w:hAnsi="Calibri"/>
+          <w:sz w:val="22"/>
+          <w:rtl/>
+          <w:i/>
+        </w:rPr>
+      </w:pPr>
+      <w:r>
+        <w:rPr>
+          <w:rFonts w:ascii="Calibri" w:hAnsi="Calibri"/>
+          <w:sz w:val="22"/>
+          <w:i/>
+        </w:rPr>
+        <w:t xml:space="preserve">Figure 8.1 — Operation of the proposed v8-Chain protocol per round (grey: inherited; green: new in v8; orange: new in v8-Chain).</w:t>
+      </w:r>
+    </w:p>
+    <w:p>
+      <w:pPr>
+        <w:spacing w:after="120"/>
+        <w:jc w:val="center"/>
+        <w:rPr>
+          <w:rFonts w:ascii="Calibri" w:hAnsi="Calibri"/>
+          <w:sz w:val="22"/>
+          <w:rtl/>
+        </w:rPr>
+      </w:pPr>
+      <w:r>
+        <w:drawing>
+          <wp:inline xmlns:a="http://schemas.openxmlformats.org/drawingml/2006/main" xmlns:pic="http://schemas.openxmlformats.org/drawingml/2006/picture">
+            <wp:extent cx="5760720" cy="3117566"/>
+            <wp:docPr id="2" name="Picture 2"/>
+            <wp:cNvGraphicFramePr>
+              <a:graphicFrameLocks noChangeAspect="1"/>
+            </wp:cNvGraphicFramePr>
+            <a:graphic>
+              <a:graphicData uri="http://schemas.openxmlformats.org/drawingml/2006/picture">
+                <pic:pic>
+                  <pic:nvPicPr>
+                    <pic:cNvPr id="0" name="v8_chain_topology.png"/>
+                    <pic:cNvPicPr/>
+                  </pic:nvPicPr>
+                  <pic:blipFill>
+                    <a:blip r:embed="rId8"/>
+                    <a:stretch>
+                      <a:fillRect/>
+                    </a:stretch>
+                  </pic:blipFill>
+                  <pic:spPr>
+                    <a:xfrm>
+                      <a:off x="0" y="0"/>
+                      <a:ext cx="5760720" cy="3117566"/>
+                    </a:xfrm>
+                    <a:prstGeom prst="rect"/>
+                  </pic:spPr>
+                </pic:pic>
+              </a:graphicData>
+            </a:graphic>
+          </wp:inline>
+        </w:drawing>
+      </w:r>
+    </w:p>
+    <w:p>
+      <w:pPr>
+        <w:spacing w:after="120"/>
+        <w:jc w:val="center"/>
+        <w:rPr>
+          <w:rFonts w:ascii="Calibri" w:hAnsi="Calibri"/>
+          <w:sz w:val="22"/>
+          <w:rtl/>
+          <w:i/>
+        </w:rPr>
+      </w:pPr>
+      <w:r>
+        <w:rPr>
+          <w:rFonts w:ascii="Calibri" w:hAnsi="Calibri"/>
+          <w:sz w:val="22"/>
+          <w:i/>
+        </w:rPr>
+        <w:t xml:space="preserve">Figure 8.2 — Network structure in round 1 (seed 12345): at the center BS no CH relays and nearby members send directly to the BS; at the far BS the CHs self-organise into an energy-aware relay chain.</w:t>
+      </w:r>
+    </w:p>
     <w:p/>
     <w:p>
       <w:pPr>
@@ -11866,6 +13432,44 @@
           </w:p>
         </w:tc>
       </w:tr>
+      <w:tr>
+        <w:trPr>
+          <w:trHeight w:val="79"/>
+        </w:trPr>
+        <w:tc>
+          <w:tcPr>
+            <w:tcW w:w="3898" w:type="dxa"/>
+            <w:shd w:val="clear" w:color="auto" w:fill="F2F6F8"/>
+          </w:tcPr>
+          <w:p>
+            <w:r>
+              <w:t xml:space="preserve">One configuration for any sink placement</w:t>
+            </w:r>
+          </w:p>
+        </w:tc>
+        <w:tc>
+          <w:tcPr>
+            <w:tcW w:w="3105" w:type="dxa"/>
+            <w:shd w:val="clear" w:color="auto" w:fill="F2F6F8"/>
+          </w:tcPr>
+          <w:p>
+            <w:r>
+              <w:t xml:space="preserve">v8-Chain</w:t>
+            </w:r>
+          </w:p>
+        </w:tc>
+        <w:tc>
+          <w:tcPr>
+            <w:tcW w:w="3712" w:type="dxa"/>
+            <w:shd w:val="clear" w:color="auto" w:fill="F2F6F8"/>
+          </w:tcPr>
+          <w:p>
+            <w:r>
+              <w:t xml:space="preserve">Identical to v8 at a center sink; best FND/PDR and v7-level HND/LND at a far sink</w:t>
+            </w:r>
+          </w:p>
+        </w:tc>
+      </w:tr>
     </w:tbl>
     <w:p>
       <w:pPr>
@@ -11895,7 +13499,7 @@
           <w:sz w:val="22"/>
           <w:szCs w:val="22"/>
         </w:rPr>
-        <w:t xml:space="preserve">Across all three protocol families studied, six findings stand out as the most consequential for anyone designing or extending a clustering protocol for WSNs:</w:t>
+        <w:t xml:space="preserve">Across all three protocol families studied, seven findings stand out as the most consequential for anyone designing or extending a clustering protocol for WSNs:</w:t>
       </w:r>
     </w:p>
     <w:p>
@@ -12011,6 +13615,19 @@
           <w:szCs w:val="22"/>
         </w:rPr>
         <w:t xml:space="preserve">6. Preventing CH death beats repairing it, and not every packet needs a CH. The optimized v8 adds proactive CH handover (the CH hands over before it can die), direct-to-BS delivery for nodes nearer the sink than their CH, and an energy gate on CH election on top of v5b's backup failover. At the center BS this raised FND from 1730 to 2621 (+51%), HND from 2091 to 2711 (+30%) and PDR from 97.31% to 99.22%, delivering 33% more packets with the same 50 J — the best result of the entire family. The ablation shows the gain comes mainly from direct-to-BS and the energy gate, which makes it geometry-dependent: at a far sink the relay chain remains the better lifetime choice.</w:t>
+      </w:r>
+    </w:p>
+    <w:p>
+      <w:pPr>
+        <w:spacing w:after="120"/>
+      </w:pPr>
+      <w:r>
+        <w:rPr>
+          <w:rFonts w:ascii="Calibri" w:eastAsia="Calibri" w:hAnsi="Calibri" w:cs="Calibri"/>
+          <w:sz w:val="22"/>
+          <w:szCs w:val="22"/>
+        </w:rPr>
+        <w:t xml:space="preserve">7. Relaying should be a per-CH energy decision, not a fixed topology. Letting each CH relay through a closer CH only when that is cheaper than going direct (v8-Chain) reproduces v8 exactly at a center sink and, at a far sink, lifts v8 from 1471/1646/1716 to 1716/1886/1956 rounds with 99.07% PDR — 36% later first-node death than the v7 chain at practically the same HND/LND. A fixed ordered chain, by contrast, hurts at the center sink (FND 2621→2566).</w:t>
       </w:r>
     </w:p>
     <w:p>
@@ -12154,7 +13771,7 @@
           <w:sz w:val="22"/>
           <w:szCs w:val="22"/>
         </w:rPr>
-        <w:t xml:space="preserve">• v8's largest gain (direct-to-BS) depends on the sink being inside or near the field; at the far-BS placement it almost never activates and v8's HND/LND fall below the chain-based v7. v8 was evaluated at two BS placements and 8 random topologies only.</w:t>
+        <w:t xml:space="preserve">• v8's largest gain (direct-to-BS) depends on the sink being inside or near the field; at a far sink the energy-aware relay of v8-Chain is needed to match the v7 chain's HND/LND. Only two BS placements and 8 random topologies were evaluated.</w:t>
       </w:r>
     </w:p>
     <w:p/>
@@ -12263,7 +13880,7 @@
           <w:sz w:val="22"/>
           <w:szCs w:val="22"/>
         </w:rPr>
-        <w:t xml:space="preserve">• Combine v8's proactive handover, energy gate and direct-to-BS rule with the v7 chain / v7.1 multihop relay so that a single configuration keeps v8's center-BS gains while recovering v7's far-BS lifetime.</w:t>
+        <w:t xml:space="preserve">• Evaluate v8-Chain across more sink placements (edge, corner, several distances) and field sizes, and compare its energy-aware relay rule with a globally optimised (e.g., minimum-energy tree) routing to quantify how close the greedy per-CH decision is to optimal.</w:t>
       </w:r>
     </w:p>
     <w:p>
@@ -12294,7 +13911,7 @@
           <w:sz w:val="22"/>
           <w:szCs w:val="22"/>
         </w:rPr>
-        <w:t xml:space="preserve">This work set out to design an energy-efficient, secure, and reliable clustering scheme for wireless sensor networks, starting from the well-known LEACH- and HEED-style baselines and evolving an original protocol family through explicit versions v1 through v7.2 and a final optimized v8. The guiding method throughout was to isolate exactly one mechanism change per version — CH-selection formula, cluster-reuse interval, backup failover, relay chaining, or multihop routing — so that each change's individual contribution to FND, HND, LND and PDR could be measured and attributed rather than obscured inside a bundle of simultaneous modifications.</w:t>
+        <w:t xml:space="preserve">This work set out to design an energy-efficient, secure, and reliable clustering scheme for wireless sensor networks, starting from the well-known LEACH- and HEED-style baselines and evolving an original protocol family through explicit versions v1 through v7.2 a final optimized v8 and its energy-aware relay extension v8-Chain. The guiding method throughout was to isolate exactly one mechanism change per version — CH-selection formula, cluster-reuse interval, backup failover, relay chaining, or multihop routing — so that each change's individual contribution to FND, HND, LND and PDR could be measured and attributed rather than obscured inside a bundle of simultaneous modifications.</w:t>
       </w:r>
     </w:p>
     <w:p>
@@ -12307,7 +13924,7 @@
           <w:sz w:val="22"/>
           <w:szCs w:val="22"/>
         </w:rPr>
-        <w:t xml:space="preserve">The main conclusion that emerges is that architectural changes — how a cluster head is chosen and how it relays data — mattered far more to the final results than any single parameter tweak: the switch to a single-pass energy×connectivity CH-selection score alone produced a 94% lifetime gain, while stretching a reuse interval in isolation actively made every metric worse. Among the relay-based versions, v7 (Center) is the best-balanced configuration (FND 1551, HND 1976, LND 2066, PDR 98.432%) and v7.1 (Multihop) reaches PDR 98.49%. The final optimized v8 — which prevents CH death through proactive handover, repairs it through backup failover, and lets nodes near the sink bypass their CH — surpasses all of them at the center BS (FND 2621, HND 2711, LND 2761, PDR 99.22%), while the relay chain remains preferable for a far sink. Combined with this thesis's hybrid cryptography layer, these results demonstrate that energy-aware clustering and secure communication can be co-designed without a significant reliability penalty, giving a practical foundation for deploying secure, long-lived wireless sensor networks.</w:t>
+        <w:t xml:space="preserve">The main conclusion that emerges is that architectural changes — how a cluster head is chosen and how it relays data — mattered far more to the final results than any single parameter tweak: the switch to a single-pass energy×connectivity CH-selection score alone produced a 94% lifetime gain, while stretching a reuse interval in isolation actively made every metric worse. Among the relay-based versions, v7 (Center) is the best-balanced configuration (FND 1551, HND 1976, LND 2066, PDR 98.432%) and v7.1 (Multihop) reaches PDR 98.49%. The final optimized v8 — which prevents CH death through proactive handover, repairs it through backup failover, and lets nodes near the sink bypass their CH — surpasses all of them at the center BS (FND 2621, HND 2711, LND 2761, PDR 99.22%), and its extension v8-Chain, which lets each CH relay through a closer CH only when that saves energy, keeps those center-BS results while matching the v7 chain at a far sink (FND 1716, HND 1886, LND 1956, PDR 99.07%) — a single configuration that performs at or near the best in both placements. Combined with this thesis's hybrid cryptography layer, these results demonstrate that energy-aware clustering and secure communication can be co-designed without a significant reliability penalty, giving a practical foundation for deploying secure, long-lived wireless sensor networks.</w:t>
       </w:r>
     </w:p>
     <w:sectPr>

</xml_diff>